<commit_message>
docs: update Project Deliverables Guide with current status
- Updated deliverable status table: Document 9 now Complete (PPTX added)
- Added .pptx file to FILES IN REPOSITORY table
- Added PowerPoint format standard section to FORMAT STANDARD
- Remaining work now only Document 10 (User Manual / SOP)
- Updated README with PPTX build command and PowerPoint format standard
</commit_message>
<xml_diff>
--- a/OUTPUT/PROJECT-DELIVERABLES-GUIDE.docx
+++ b/OUTPUT/PROJECT-DELIVERABLES-GUIDE.docx
@@ -1310,7 +1310,7 @@
                 <w:color w:val="000000"/>
                 <w:sz w:val="24"/>
               </w:rPr>
-              <w:t>Not yet created</w:t>
+              <w:t>Document 9: Grand Project Presentation Deck</w:t>
             </w:r>
           </w:p>
         </w:tc>
@@ -1350,7 +1350,7 @@
                 <w:color w:val="000000"/>
                 <w:sz w:val="24"/>
               </w:rPr>
-              <w:t>Pending</w:t>
+              <w:t>Complete</w:t>
             </w:r>
           </w:p>
         </w:tc>
@@ -1370,6 +1370,7 @@
                 <w:color w:val="000000"/>
                 <w:sz w:val="24"/>
               </w:rPr>
+              <w:t>DOC 09 Grand Project Presentation.pptx</w:t>
             </w:r>
           </w:p>
         </w:tc>
@@ -1527,7 +1528,7 @@
           <w:color w:val="000000"/>
           <w:sz w:val="24"/>
         </w:rPr>
-        <w:t>Per the corrected roadmap (turn 99), Documents 3 through 8 were consolidated into a single Master Document to avoid fragmentation and ensure strict traceability between requirements, traceability matrix, validation, management, and database design. This master document is the single source of truth for Phases 2 through 5 and the SWE1205 database deliverable.</w:t>
+        <w:t>Per the corrected roadmap (turn 99), Documents 3 through 8 from the original roadmap have been consolidated into a single Master Document to avoid fragmentation and ensure strict traceability between requirements, traceability matrix, validation, management, and database design. This master document is the single source of truth for Phases 2 through 5 and the SWE1205 database deliverable.</w:t>
       </w:r>
     </w:p>
     <w:p>
@@ -2239,6 +2240,174 @@
                 <w:color w:val="000000"/>
                 <w:sz w:val="24"/>
               </w:rPr>
+              <w:t>DOC 09 Grand Project Presentation.pptx</w:t>
+            </w:r>
+          </w:p>
+        </w:tc>
+        <w:tc>
+          <w:tcPr>
+            <w:tcW w:type="dxa" w:w="4513"/>
+          </w:tcPr>
+          <w:p>
+            <w:pPr>
+              <w:spacing w:lineRule="auto" w:line="276" w:before="40" w:after="40"/>
+            </w:pPr>
+            <w:r/>
+            <w:r>
+              <w:rPr>
+                <w:rFonts w:ascii="Times New Roman" w:hAnsi="Times New Roman" w:cs="Times New Roman" w:eastAsia="Times New Roman"/>
+                <w:b w:val="0"/>
+                <w:color w:val="000000"/>
+                <w:sz w:val="24"/>
+              </w:rPr>
+              <w:t>Document 9: Grand Project Presentation Deck (PPTX)</w:t>
+            </w:r>
+          </w:p>
+        </w:tc>
+      </w:tr>
+      <w:tr>
+        <w:tc>
+          <w:tcPr>
+            <w:tcW w:type="dxa" w:w="4513"/>
+          </w:tcPr>
+          <w:p>
+            <w:pPr>
+              <w:spacing w:lineRule="auto" w:line="276" w:before="40" w:after="40"/>
+            </w:pPr>
+            <w:r/>
+            <w:r>
+              <w:rPr>
+                <w:rFonts w:ascii="Times New Roman" w:hAnsi="Times New Roman" w:cs="Times New Roman" w:eastAsia="Times New Roman"/>
+                <w:b w:val="0"/>
+                <w:color w:val="000000"/>
+                <w:sz w:val="24"/>
+              </w:rPr>
+              <w:t>DOC 09 Grand Project Presentation Deck.docx</w:t>
+            </w:r>
+          </w:p>
+        </w:tc>
+        <w:tc>
+          <w:tcPr>
+            <w:tcW w:type="dxa" w:w="4513"/>
+          </w:tcPr>
+          <w:p>
+            <w:pPr>
+              <w:spacing w:lineRule="auto" w:line="276" w:before="40" w:after="40"/>
+            </w:pPr>
+            <w:r/>
+            <w:r>
+              <w:rPr>
+                <w:rFonts w:ascii="Times New Roman" w:hAnsi="Times New Roman" w:cs="Times New Roman" w:eastAsia="Times New Roman"/>
+                <w:b w:val="0"/>
+                <w:color w:val="000000"/>
+                <w:sz w:val="24"/>
+              </w:rPr>
+              <w:t>Document 9: Grand Project Presentation Deck (DOCX backup)</w:t>
+            </w:r>
+          </w:p>
+        </w:tc>
+      </w:tr>
+      <w:tr>
+        <w:tc>
+          <w:tcPr>
+            <w:tcW w:type="dxa" w:w="4513"/>
+          </w:tcPr>
+          <w:p>
+            <w:pPr>
+              <w:spacing w:lineRule="auto" w:line="276" w:before="40" w:after="40"/>
+            </w:pPr>
+            <w:r/>
+            <w:r>
+              <w:rPr>
+                <w:rFonts w:ascii="Times New Roman" w:hAnsi="Times New Roman" w:cs="Times New Roman" w:eastAsia="Times New Roman"/>
+                <w:b w:val="0"/>
+                <w:color w:val="000000"/>
+                <w:sz w:val="24"/>
+              </w:rPr>
+              <w:t>MASTER Requirements Specification Traceability Management.docx</w:t>
+            </w:r>
+          </w:p>
+        </w:tc>
+        <w:tc>
+          <w:tcPr>
+            <w:tcW w:type="dxa" w:w="4513"/>
+          </w:tcPr>
+          <w:p>
+            <w:pPr>
+              <w:spacing w:lineRule="auto" w:line="276" w:before="40" w:after="40"/>
+            </w:pPr>
+            <w:r/>
+            <w:r>
+              <w:rPr>
+                <w:rFonts w:ascii="Times New Roman" w:hAnsi="Times New Roman" w:cs="Times New Roman" w:eastAsia="Times New Roman"/>
+                <w:b w:val="0"/>
+                <w:color w:val="000000"/>
+                <w:sz w:val="24"/>
+              </w:rPr>
+              <w:t>Master: SRS + RTM + V&amp;V + Management + DB Design</w:t>
+            </w:r>
+          </w:p>
+        </w:tc>
+      </w:tr>
+      <w:tr>
+        <w:tc>
+          <w:tcPr>
+            <w:tcW w:type="dxa" w:w="4513"/>
+          </w:tcPr>
+          <w:p>
+            <w:pPr>
+              <w:spacing w:lineRule="auto" w:line="276" w:before="40" w:after="40"/>
+            </w:pPr>
+            <w:r/>
+            <w:r>
+              <w:rPr>
+                <w:rFonts w:ascii="Times New Roman" w:hAnsi="Times New Roman" w:cs="Times New Roman" w:eastAsia="Times New Roman"/>
+                <w:b w:val="0"/>
+                <w:color w:val="000000"/>
+                <w:sz w:val="24"/>
+              </w:rPr>
+              <w:t>PROJECT DELIVERABLES GUIDE.docx</w:t>
+            </w:r>
+          </w:p>
+        </w:tc>
+        <w:tc>
+          <w:tcPr>
+            <w:tcW w:type="dxa" w:w="4513"/>
+          </w:tcPr>
+          <w:p>
+            <w:pPr>
+              <w:spacing w:lineRule="auto" w:line="276" w:before="40" w:after="40"/>
+            </w:pPr>
+            <w:r/>
+            <w:r>
+              <w:rPr>
+                <w:rFonts w:ascii="Times New Roman" w:hAnsi="Times New Roman" w:cs="Times New Roman" w:eastAsia="Times New Roman"/>
+                <w:b w:val="0"/>
+                <w:color w:val="000000"/>
+                <w:sz w:val="24"/>
+              </w:rPr>
+              <w:t>Project Deliverables Guide</w:t>
+            </w:r>
+          </w:p>
+        </w:tc>
+      </w:tr>
+      <w:tr>
+        <w:tc>
+          <w:tcPr>
+            <w:tcW w:type="dxa" w:w="4513"/>
+          </w:tcPr>
+          <w:p>
+            <w:pPr>
+              <w:spacing w:lineRule="auto" w:line="276" w:before="40" w:after="40"/>
+            </w:pPr>
+            <w:r/>
+            <w:r>
+              <w:rPr>
+                <w:rFonts w:ascii="Times New Roman" w:hAnsi="Times New Roman" w:cs="Times New Roman" w:eastAsia="Times New Roman"/>
+                <w:b w:val="0"/>
+                <w:color w:val="000000"/>
+                <w:sz w:val="24"/>
+              </w:rPr>
               <w:t>CONTEXT.md</w:t>
             </w:r>
           </w:p>
@@ -2365,6 +2534,90 @@
                 <w:color w:val="000000"/>
                 <w:sz w:val="24"/>
               </w:rPr>
+              <w:t>specs/spec_guide.json</w:t>
+            </w:r>
+          </w:p>
+        </w:tc>
+        <w:tc>
+          <w:tcPr>
+            <w:tcW w:type="dxa" w:w="4513"/>
+          </w:tcPr>
+          <w:p>
+            <w:pPr>
+              <w:spacing w:lineRule="auto" w:line="276" w:before="40" w:after="40"/>
+            </w:pPr>
+            <w:r/>
+            <w:r>
+              <w:rPr>
+                <w:rFonts w:ascii="Times New Roman" w:hAnsi="Times New Roman" w:cs="Times New Roman" w:eastAsia="Times New Roman"/>
+                <w:b w:val="0"/>
+                <w:color w:val="000000"/>
+                <w:sz w:val="24"/>
+              </w:rPr>
+              <w:t>This guide source spec</w:t>
+            </w:r>
+          </w:p>
+        </w:tc>
+      </w:tr>
+      <w:tr>
+        <w:tc>
+          <w:tcPr>
+            <w:tcW w:type="dxa" w:w="4513"/>
+          </w:tcPr>
+          <w:p>
+            <w:pPr>
+              <w:spacing w:lineRule="auto" w:line="276" w:before="40" w:after="40"/>
+            </w:pPr>
+            <w:r/>
+            <w:r>
+              <w:rPr>
+                <w:rFonts w:ascii="Times New Roman" w:hAnsi="Times New Roman" w:cs="Times New Roman" w:eastAsia="Times New Roman"/>
+                <w:b w:val="0"/>
+                <w:color w:val="000000"/>
+                <w:sz w:val="24"/>
+              </w:rPr>
+              <w:t>specs/spec_presentation_pptx.json</w:t>
+            </w:r>
+          </w:p>
+        </w:tc>
+        <w:tc>
+          <w:tcPr>
+            <w:tcW w:type="dxa" w:w="4513"/>
+          </w:tcPr>
+          <w:p>
+            <w:pPr>
+              <w:spacing w:lineRule="auto" w:line="276" w:before="40" w:after="40"/>
+            </w:pPr>
+            <w:r/>
+            <w:r>
+              <w:rPr>
+                <w:rFonts w:ascii="Times New Roman" w:hAnsi="Times New Roman" w:cs="Times New Roman" w:eastAsia="Times New Roman"/>
+                <w:b w:val="0"/>
+                <w:color w:val="000000"/>
+                <w:sz w:val="24"/>
+              </w:rPr>
+              <w:t>Presentation deck source spec (PPTX)</w:t>
+            </w:r>
+          </w:p>
+        </w:tc>
+      </w:tr>
+      <w:tr>
+        <w:tc>
+          <w:tcPr>
+            <w:tcW w:type="dxa" w:w="4513"/>
+          </w:tcPr>
+          <w:p>
+            <w:pPr>
+              <w:spacing w:lineRule="auto" w:line="276" w:before="40" w:after="40"/>
+            </w:pPr>
+            <w:r/>
+            <w:r>
+              <w:rPr>
+                <w:rFonts w:ascii="Times New Roman" w:hAnsi="Times New Roman" w:cs="Times New Roman" w:eastAsia="Times New Roman"/>
+                <w:b w:val="0"/>
+                <w:color w:val="000000"/>
+                <w:sz w:val="24"/>
+              </w:rPr>
               <w:t>scripts/build_docx.py</w:t>
             </w:r>
           </w:p>
@@ -2386,6 +2639,48 @@
                 <w:sz w:val="24"/>
               </w:rPr>
               <w:t>DOCX builder (Times New Roman 12pt, 1.15 spacing)</w:t>
+            </w:r>
+          </w:p>
+        </w:tc>
+      </w:tr>
+      <w:tr>
+        <w:tc>
+          <w:tcPr>
+            <w:tcW w:type="dxa" w:w="4513"/>
+          </w:tcPr>
+          <w:p>
+            <w:pPr>
+              <w:spacing w:lineRule="auto" w:line="276" w:before="40" w:after="40"/>
+            </w:pPr>
+            <w:r/>
+            <w:r>
+              <w:rPr>
+                <w:rFonts w:ascii="Times New Roman" w:hAnsi="Times New Roman" w:cs="Times New Roman" w:eastAsia="Times New Roman"/>
+                <w:b w:val="0"/>
+                <w:color w:val="000000"/>
+                <w:sz w:val="24"/>
+              </w:rPr>
+              <w:t>scripts/build_pptx.py</w:t>
+            </w:r>
+          </w:p>
+        </w:tc>
+        <w:tc>
+          <w:tcPr>
+            <w:tcW w:type="dxa" w:w="4513"/>
+          </w:tcPr>
+          <w:p>
+            <w:pPr>
+              <w:spacing w:lineRule="auto" w:line="276" w:before="40" w:after="40"/>
+            </w:pPr>
+            <w:r/>
+            <w:r>
+              <w:rPr>
+                <w:rFonts w:ascii="Times New Roman" w:hAnsi="Times New Roman" w:cs="Times New Roman" w:eastAsia="Times New Roman"/>
+                <w:b w:val="0"/>
+                <w:color w:val="000000"/>
+                <w:sz w:val="24"/>
+              </w:rPr>
+              <w:t>PPTX builder (Arial 18pt, 1.15 spacing)</w:t>
             </w:r>
           </w:p>
         </w:tc>
@@ -2628,68 +2923,6 @@
                 <w:color w:val="000000"/>
                 <w:sz w:val="24"/>
               </w:rPr>
-              <w:t>9. Grand Project Presentation Deck</w:t>
-            </w:r>
-          </w:p>
-        </w:tc>
-        <w:tc>
-          <w:tcPr>
-            <w:tcW w:type="dxa" w:w="3009"/>
-          </w:tcPr>
-          <w:p>
-            <w:pPr>
-              <w:spacing w:lineRule="auto" w:line="276" w:before="40" w:after="40"/>
-            </w:pPr>
-            <w:r/>
-            <w:r>
-              <w:rPr>
-                <w:rFonts w:ascii="Times New Roman" w:hAnsi="Times New Roman" w:cs="Times New Roman" w:eastAsia="Times New Roman"/>
-                <w:b w:val="0"/>
-                <w:color w:val="000000"/>
-                <w:sz w:val="24"/>
-              </w:rPr>
-              <w:t>Slide deck for end of semester Grand Presentation covering ground truth problem, elicitation challenges, synthesized solution, database schema, system demo</w:t>
-            </w:r>
-          </w:p>
-        </w:tc>
-        <w:tc>
-          <w:tcPr>
-            <w:tcW w:type="dxa" w:w="3009"/>
-          </w:tcPr>
-          <w:p>
-            <w:pPr>
-              <w:spacing w:lineRule="auto" w:line="276" w:before="40" w:after="40"/>
-            </w:pPr>
-            <w:r/>
-            <w:r>
-              <w:rPr>
-                <w:rFonts w:ascii="Times New Roman" w:hAnsi="Times New Roman" w:cs="Times New Roman" w:eastAsia="Times New Roman"/>
-                <w:b w:val="0"/>
-                <w:color w:val="000000"/>
-                <w:sz w:val="24"/>
-              </w:rPr>
-              <w:t>High</w:t>
-            </w:r>
-          </w:p>
-        </w:tc>
-      </w:tr>
-      <w:tr>
-        <w:tc>
-          <w:tcPr>
-            <w:tcW w:type="dxa" w:w="3009"/>
-          </w:tcPr>
-          <w:p>
-            <w:pPr>
-              <w:spacing w:lineRule="auto" w:line="276" w:before="40" w:after="40"/>
-            </w:pPr>
-            <w:r/>
-            <w:r>
-              <w:rPr>
-                <w:rFonts w:ascii="Times New Roman" w:hAnsi="Times New Roman" w:cs="Times New Roman" w:eastAsia="Times New Roman"/>
-                <w:b w:val="0"/>
-                <w:color w:val="000000"/>
-                <w:sz w:val="24"/>
-              </w:rPr>
               <w:t>10. User Manual / SOP</w:t>
             </w:r>
           </w:p>
@@ -2767,7 +3000,21 @@
           <w:color w:val="000000"/>
           <w:sz w:val="24"/>
         </w:rPr>
-        <w:t>All documents follow a fixed format standard enforced by scripts/build_docx.py:</w:t>
+        <w:t>All documents follow a fixed format standard enforced by scripts/build_docx.py and scripts/build_pptx.py:</w:t>
+      </w:r>
+    </w:p>
+    <w:p>
+      <w:pPr>
+        <w:spacing w:lineRule="auto" w:line="276" w:before="240" w:after="120"/>
+      </w:pPr>
+      <w:r>
+        <w:rPr>
+          <w:rFonts w:ascii="Times New Roman" w:hAnsi="Times New Roman" w:cs="Times New Roman" w:eastAsia="Times New Roman"/>
+          <w:b/>
+          <w:color w:val="000000"/>
+          <w:sz w:val="24"/>
+        </w:rPr>
+        <w:t>Word documents (.docx)</w:t>
       </w:r>
     </w:p>
     <w:p>
@@ -2883,6 +3130,135 @@
           <w:sz w:val="24"/>
         </w:rPr>
         <w:t>Page: A4, 25.4 mm margins</w:t>
+      </w:r>
+    </w:p>
+    <w:p>
+      <w:pPr>
+        <w:spacing w:lineRule="auto" w:line="276" w:before="240" w:after="120"/>
+      </w:pPr>
+      <w:r>
+        <w:rPr>
+          <w:rFonts w:ascii="Times New Roman" w:hAnsi="Times New Roman" w:cs="Times New Roman" w:eastAsia="Times New Roman"/>
+          <w:b/>
+          <w:color w:val="000000"/>
+          <w:sz w:val="24"/>
+        </w:rPr>
+        <w:t>PowerPoint presentations (.pptx)</w:t>
+      </w:r>
+    </w:p>
+    <w:p>
+      <w:pPr>
+        <w:spacing w:lineRule="auto" w:line="276" w:before="0" w:after="60"/>
+      </w:pPr>
+      <w:r>
+        <w:rPr>
+          <w:rFonts w:ascii="Times New Roman" w:hAnsi="Times New Roman" w:cs="Times New Roman" w:eastAsia="Times New Roman"/>
+          <w:b w:val="0"/>
+          <w:color w:val="000000"/>
+          <w:sz w:val="24"/>
+        </w:rPr>
+        <w:t xml:space="preserve">•  </w:t>
+      </w:r>
+      <w:r>
+        <w:rPr>
+          <w:rFonts w:ascii="Times New Roman" w:hAnsi="Times New Roman" w:cs="Times New Roman" w:eastAsia="Times New Roman"/>
+          <w:b w:val="0"/>
+          <w:color w:val="000000"/>
+          <w:sz w:val="24"/>
+        </w:rPr>
+        <w:t>Font: Arial, 18 pt body, 20 pt subtitle, 32 pt title</w:t>
+      </w:r>
+    </w:p>
+    <w:p>
+      <w:pPr>
+        <w:spacing w:lineRule="auto" w:line="276" w:before="0" w:after="60"/>
+      </w:pPr>
+      <w:r>
+        <w:rPr>
+          <w:rFonts w:ascii="Times New Roman" w:hAnsi="Times New Roman" w:cs="Times New Roman" w:eastAsia="Times New Roman"/>
+          <w:b w:val="0"/>
+          <w:color w:val="000000"/>
+          <w:sz w:val="24"/>
+        </w:rPr>
+        <w:t xml:space="preserve">•  </w:t>
+      </w:r>
+      <w:r>
+        <w:rPr>
+          <w:rFonts w:ascii="Times New Roman" w:hAnsi="Times New Roman" w:cs="Times New Roman" w:eastAsia="Times New Roman"/>
+          <w:b w:val="0"/>
+          <w:color w:val="000000"/>
+          <w:sz w:val="24"/>
+        </w:rPr>
+        <w:t>Background: White (FFFFFF)</w:t>
+      </w:r>
+    </w:p>
+    <w:p>
+      <w:pPr>
+        <w:spacing w:lineRule="auto" w:line="276" w:before="0" w:after="60"/>
+      </w:pPr>
+      <w:r>
+        <w:rPr>
+          <w:rFonts w:ascii="Times New Roman" w:hAnsi="Times New Roman" w:cs="Times New Roman" w:eastAsia="Times New Roman"/>
+          <w:b w:val="0"/>
+          <w:color w:val="000000"/>
+          <w:sz w:val="24"/>
+        </w:rPr>
+        <w:t xml:space="preserve">•  </w:t>
+      </w:r>
+      <w:r>
+        <w:rPr>
+          <w:rFonts w:ascii="Times New Roman" w:hAnsi="Times New Roman" w:cs="Times New Roman" w:eastAsia="Times New Roman"/>
+          <w:b w:val="0"/>
+          <w:color w:val="000000"/>
+          <w:sz w:val="24"/>
+        </w:rPr>
+        <w:t>Colour: Black (000000)</w:t>
+      </w:r>
+    </w:p>
+    <w:p>
+      <w:pPr>
+        <w:spacing w:lineRule="auto" w:line="276" w:before="0" w:after="60"/>
+      </w:pPr>
+      <w:r>
+        <w:rPr>
+          <w:rFonts w:ascii="Times New Roman" w:hAnsi="Times New Roman" w:cs="Times New Roman" w:eastAsia="Times New Roman"/>
+          <w:b w:val="0"/>
+          <w:color w:val="000000"/>
+          <w:sz w:val="24"/>
+        </w:rPr>
+        <w:t xml:space="preserve">•  </w:t>
+      </w:r>
+      <w:r>
+        <w:rPr>
+          <w:rFonts w:ascii="Times New Roman" w:hAnsi="Times New Roman" w:cs="Times New Roman" w:eastAsia="Times New Roman"/>
+          <w:b w:val="0"/>
+          <w:color w:val="000000"/>
+          <w:sz w:val="24"/>
+        </w:rPr>
+        <w:t>Bold: Headings, table headers, lead in phrases only</w:t>
+      </w:r>
+    </w:p>
+    <w:p>
+      <w:pPr>
+        <w:spacing w:lineRule="auto" w:line="276" w:before="0" w:after="60"/>
+      </w:pPr>
+      <w:r>
+        <w:rPr>
+          <w:rFonts w:ascii="Times New Roman" w:hAnsi="Times New Roman" w:cs="Times New Roman" w:eastAsia="Times New Roman"/>
+          <w:b w:val="0"/>
+          <w:color w:val="000000"/>
+          <w:sz w:val="24"/>
+        </w:rPr>
+        <w:t xml:space="preserve">•  </w:t>
+      </w:r>
+      <w:r>
+        <w:rPr>
+          <w:rFonts w:ascii="Times New Roman" w:hAnsi="Times New Roman" w:cs="Times New Roman" w:eastAsia="Times New Roman"/>
+          <w:b w:val="0"/>
+          <w:color w:val="000000"/>
+          <w:sz w:val="24"/>
+        </w:rPr>
+        <w:t>Punctuation: Plain ASCII, no quotes, no semicolons, no hyphens, no em dashes</w:t>
       </w:r>
     </w:p>
     <w:sectPr>

</xml_diff>